<commit_message>
Expand Ruth 1 analysis with pausal forms and pronominal suffixes
Add two chapter-wide grammar sections taught in the course (per the
course lecture deck): pausal forms (e.g. lehem/lahem) and pronominal
suffixes (possessive and object), each compared to Modern Hebrew, plus
a Kutscher reference. Ten footnotes total.

Co-Authored-By: Claude Opus 4.8 <noreply@anthropic.com>
Claude-Session: https://claude.ai/code/session_01XS9AzHy9ZUWev3iWAec5os
</commit_message>
<xml_diff>
--- a/ניתוח-לשוני-רות-א.docx
+++ b/ניתוח-לשוני-רות-א.docx
@@ -5624,6 +5624,653 @@
       </w:r>
     </w:p>
     <w:p>
+      <w:pPr>
+        <w:pStyle w:val="Heading2"/>
+        <w:bidi/>
+        <w:spacing w:after="120" w:before="220"/>
+        <w:jc w:val="right"/>
+      </w:pPr>
+      <w:r>
+        <w:rPr>
+          <w:rFonts w:ascii="David" w:cs="David" w:eastAsia="David" w:hAnsi="David"/>
+          <w:b/>
+          <w:bCs/>
+          <w:sz w:val="26"/>
+          <w:szCs w:val="26"/>
+          <w:rtl/>
+        </w:rPr>
+        <w:t xml:space="preserve">מאפיינים דקדוקיים נוספים שנלמדו בקורס — סקירה כלל-פרקית</w:t>
+      </w:r>
+    </w:p>
+    <w:p>
+      <w:pPr>
+        <w:bidi/>
+        <w:spacing w:after="120" w:line="320"/>
+        <w:jc w:val="both"/>
+      </w:pPr>
+      <w:r>
+        <w:rPr>
+          <w:rFonts w:ascii="David" w:cs="David" w:eastAsia="David" w:hAnsi="David"/>
+          <w:sz w:val="24"/>
+          <w:szCs w:val="24"/>
+          <w:rtl/>
+        </w:rPr>
+        <w:t xml:space="preserve">בצד המאפיינים שנדונו פסוק-אחר-פסוק, שני נושאים מרכזיים שנלמדו בקורס (</w:t>
+      </w:r>
+      <w:r>
+        <w:rPr>
+          <w:rFonts w:ascii="David" w:cs="David" w:eastAsia="David" w:hAnsi="David"/>
+          <w:i/>
+          <w:iCs/>
+          <w:sz w:val="24"/>
+          <w:szCs w:val="24"/>
+          <w:rtl/>
+        </w:rPr>
+        <w:t xml:space="preserve">מצגת „לשון המקרא — מאפיינים בולטים”</w:t>
+      </w:r>
+      <w:r>
+        <w:rPr>
+          <w:rFonts w:ascii="David" w:cs="David" w:eastAsia="David" w:hAnsi="David"/>
+          <w:sz w:val="24"/>
+          <w:szCs w:val="24"/>
+          <w:rtl/>
+        </w:rPr>
+        <w:t xml:space="preserve">) עולים לכל אורך הפרק ומחייבים התייחסות מרוכזת: </w:t>
+      </w:r>
+      <w:r>
+        <w:rPr>
+          <w:rFonts w:ascii="David" w:cs="David" w:eastAsia="David" w:hAnsi="David"/>
+          <w:b/>
+          <w:bCs/>
+          <w:sz w:val="24"/>
+          <w:szCs w:val="24"/>
+          <w:rtl/>
+        </w:rPr>
+        <w:t xml:space="preserve">צורות ההפסק</w:t>
+      </w:r>
+      <w:r>
+        <w:rPr>
+          <w:rFonts w:ascii="David" w:cs="David" w:eastAsia="David" w:hAnsi="David"/>
+          <w:sz w:val="24"/>
+          <w:szCs w:val="24"/>
+          <w:rtl/>
+        </w:rPr>
+        <w:t xml:space="preserve"> ו</w:t>
+      </w:r>
+      <w:r>
+        <w:rPr>
+          <w:rFonts w:ascii="David" w:cs="David" w:eastAsia="David" w:hAnsi="David"/>
+          <w:b/>
+          <w:bCs/>
+          <w:sz w:val="24"/>
+          <w:szCs w:val="24"/>
+          <w:rtl/>
+        </w:rPr>
+        <w:t xml:space="preserve">הכינויים החבורים</w:t>
+      </w:r>
+      <w:r>
+        <w:rPr>
+          <w:rFonts w:ascii="David" w:cs="David" w:eastAsia="David" w:hAnsi="David"/>
+          <w:sz w:val="24"/>
+          <w:szCs w:val="24"/>
+          <w:rtl/>
+        </w:rPr>
+        <w:t xml:space="preserve">. שניהם אינם פעילים בעברית המדוברת בת-ימינו במתכונתם המקראית.</w:t>
+      </w:r>
+    </w:p>
+    <w:p>
+      <w:pPr>
+        <w:bidi/>
+        <w:spacing w:after="100" w:before="160"/>
+        <w:jc w:val="right"/>
+      </w:pPr>
+      <w:r>
+        <w:rPr>
+          <w:rFonts w:ascii="David" w:cs="David" w:eastAsia="David" w:hAnsi="David"/>
+          <w:b/>
+          <w:bCs/>
+          <w:sz w:val="25"/>
+          <w:szCs w:val="25"/>
+          <w:rtl/>
+        </w:rPr>
+        <w:t xml:space="preserve">א. צורות ההפסק (פָּאוּזָה)</w:t>
+      </w:r>
+    </w:p>
+    <w:p>
+      <w:pPr>
+        <w:bidi/>
+        <w:spacing w:after="120" w:line="320"/>
+        <w:jc w:val="both"/>
+      </w:pPr>
+      <w:r>
+        <w:rPr>
+          <w:rFonts w:ascii="David" w:cs="David" w:eastAsia="David" w:hAnsi="David"/>
+          <w:sz w:val="24"/>
+          <w:szCs w:val="24"/>
+          <w:rtl/>
+        </w:rPr>
+        <w:t xml:space="preserve">במקרא צורות פועל ושם מסוימות משתנות ב</w:t>
+      </w:r>
+      <w:r>
+        <w:rPr>
+          <w:rFonts w:ascii="David" w:cs="David" w:eastAsia="David" w:hAnsi="David"/>
+          <w:b/>
+          <w:bCs/>
+          <w:sz w:val="24"/>
+          <w:szCs w:val="24"/>
+          <w:rtl/>
+        </w:rPr>
+        <w:t xml:space="preserve">מעמד ההפסק</w:t>
+      </w:r>
+      <w:r>
+        <w:rPr>
+          <w:rFonts w:ascii="David" w:cs="David" w:eastAsia="David" w:hAnsi="David"/>
+          <w:sz w:val="24"/>
+          <w:szCs w:val="24"/>
+          <w:rtl/>
+        </w:rPr>
+        <w:t xml:space="preserve"> — בעיקר בסוף פסוק (סילוק) ובאתנח — לעומת </w:t>
+      </w:r>
+      <w:r>
+        <w:rPr>
+          <w:rFonts w:ascii="David" w:cs="David" w:eastAsia="David" w:hAnsi="David"/>
+          <w:b/>
+          <w:bCs/>
+          <w:sz w:val="24"/>
+          <w:szCs w:val="24"/>
+          <w:rtl/>
+        </w:rPr>
+        <w:t xml:space="preserve">צורת ההקשר</w:t>
+      </w:r>
+      <w:r>
+        <w:rPr>
+          <w:rFonts w:ascii="David" w:cs="David" w:eastAsia="David" w:hAnsi="David"/>
+          <w:sz w:val="24"/>
+          <w:szCs w:val="24"/>
+          <w:rtl/>
+        </w:rPr>
+        <w:t xml:space="preserve">: התנועה מתארכת ולעיתים נסוג הטעם. הבחנה זו אינה קיימת בעברית בת-ימינו, שאין בה מערכת הפסק, וכל מילה נהגית באופן אחיד.</w:t>
+      </w:r>
+      <w:r>
+        <w:rPr>
+          <w:rStyle w:val="FootnoteReference"/>
+        </w:rPr>
+        <w:footnoteReference w:id="8"/>
+      </w:r>
+    </w:p>
+    <w:p>
+      <w:pPr>
+        <w:pStyle w:val="ListParagraph"/>
+        <w:numPr>
+          <w:ilvl w:val="0"/>
+          <w:numId w:val="2"/>
+        </w:numPr>
+        <w:bidi/>
+        <w:spacing w:after="80" w:line="300"/>
+        <w:jc w:val="both"/>
+      </w:pPr>
+      <w:r>
+        <w:rPr>
+          <w:rFonts w:ascii="David" w:cs="David" w:eastAsia="David" w:hAnsi="David"/>
+          <w:b/>
+          <w:bCs/>
+          <w:sz w:val="24"/>
+          <w:szCs w:val="24"/>
+          <w:rtl/>
+        </w:rPr>
+        <w:t xml:space="preserve">לֶחֶם / לָחֶם</w:t>
+      </w:r>
+      <w:r>
+        <w:rPr>
+          <w:rFonts w:ascii="David" w:cs="David" w:eastAsia="David" w:hAnsi="David"/>
+          <w:sz w:val="24"/>
+          <w:szCs w:val="24"/>
+          <w:rtl/>
+        </w:rPr>
+        <w:t xml:space="preserve"> — הדוגמה המובהקת בפרק: „בֵּית </w:t>
+      </w:r>
+      <w:r>
+        <w:rPr>
+          <w:rFonts w:ascii="David" w:cs="David" w:eastAsia="David" w:hAnsi="David"/>
+          <w:b/>
+          <w:bCs/>
+          <w:sz w:val="24"/>
+          <w:szCs w:val="24"/>
+          <w:rtl/>
+        </w:rPr>
+        <w:t xml:space="preserve">לֶחֶם</w:t>
+      </w:r>
+      <w:r>
+        <w:rPr>
+          <w:rFonts w:ascii="David" w:cs="David" w:eastAsia="David" w:hAnsi="David"/>
+          <w:sz w:val="24"/>
+          <w:szCs w:val="24"/>
+          <w:rtl/>
+        </w:rPr>
+        <w:t xml:space="preserve">” (הקשר, סֶגול) בפס׳ א, מול „לָתֵת לָהֶם </w:t>
+      </w:r>
+      <w:r>
+        <w:rPr>
+          <w:rFonts w:ascii="David" w:cs="David" w:eastAsia="David" w:hAnsi="David"/>
+          <w:b/>
+          <w:bCs/>
+          <w:sz w:val="24"/>
+          <w:szCs w:val="24"/>
+          <w:rtl/>
+        </w:rPr>
+        <w:t xml:space="preserve">לָחֶם</w:t>
+      </w:r>
+      <w:r>
+        <w:rPr>
+          <w:rFonts w:ascii="David" w:cs="David" w:eastAsia="David" w:hAnsi="David"/>
+          <w:sz w:val="24"/>
+          <w:szCs w:val="24"/>
+          <w:rtl/>
+        </w:rPr>
+        <w:t xml:space="preserve">” (הפסק, קָמץ) בפס׳ ו. בפס׳ יט מופיעות </w:t>
+      </w:r>
+      <w:r>
+        <w:rPr>
+          <w:rFonts w:ascii="David" w:cs="David" w:eastAsia="David" w:hAnsi="David"/>
+          <w:b/>
+          <w:bCs/>
+          <w:sz w:val="24"/>
+          <w:szCs w:val="24"/>
+          <w:rtl/>
+        </w:rPr>
+        <w:t xml:space="preserve">שתי הצורות זו לצד זו</w:t>
+      </w:r>
+      <w:r>
+        <w:rPr>
+          <w:rFonts w:ascii="David" w:cs="David" w:eastAsia="David" w:hAnsi="David"/>
+          <w:sz w:val="24"/>
+          <w:szCs w:val="24"/>
+          <w:rtl/>
+        </w:rPr>
+        <w:t xml:space="preserve">: „עַד בֹּאָנָה בֵּית </w:t>
+      </w:r>
+      <w:r>
+        <w:rPr>
+          <w:rFonts w:ascii="David" w:cs="David" w:eastAsia="David" w:hAnsi="David"/>
+          <w:b/>
+          <w:bCs/>
+          <w:sz w:val="24"/>
+          <w:szCs w:val="24"/>
+          <w:rtl/>
+        </w:rPr>
+        <w:t xml:space="preserve">לָחֶם</w:t>
+      </w:r>
+      <w:r>
+        <w:rPr>
+          <w:rFonts w:ascii="David" w:cs="David" w:eastAsia="David" w:hAnsi="David"/>
+          <w:sz w:val="24"/>
+          <w:szCs w:val="24"/>
+          <w:rtl/>
+        </w:rPr>
+        <w:t xml:space="preserve">” (הפסק, באתנח) מול „כְּבֹאָנָה בֵּית </w:t>
+      </w:r>
+      <w:r>
+        <w:rPr>
+          <w:rFonts w:ascii="David" w:cs="David" w:eastAsia="David" w:hAnsi="David"/>
+          <w:b/>
+          <w:bCs/>
+          <w:sz w:val="24"/>
+          <w:szCs w:val="24"/>
+          <w:rtl/>
+        </w:rPr>
+        <w:t xml:space="preserve">לֶחֶם</w:t>
+      </w:r>
+      <w:r>
+        <w:rPr>
+          <w:rFonts w:ascii="David" w:cs="David" w:eastAsia="David" w:hAnsi="David"/>
+          <w:sz w:val="24"/>
+          <w:szCs w:val="24"/>
+          <w:rtl/>
+        </w:rPr>
+        <w:t xml:space="preserve">” (הקשר). </w:t>
+      </w:r>
+    </w:p>
+    <w:p>
+      <w:pPr>
+        <w:pStyle w:val="ListParagraph"/>
+        <w:numPr>
+          <w:ilvl w:val="0"/>
+          <w:numId w:val="2"/>
+        </w:numPr>
+        <w:bidi/>
+        <w:spacing w:after="80" w:line="300"/>
+        <w:jc w:val="both"/>
+      </w:pPr>
+      <w:r>
+        <w:rPr>
+          <w:rFonts w:ascii="David" w:cs="David" w:eastAsia="David" w:hAnsi="David"/>
+          <w:b/>
+          <w:bCs/>
+          <w:sz w:val="24"/>
+          <w:szCs w:val="24"/>
+          <w:rtl/>
+        </w:rPr>
+        <w:t xml:space="preserve">עִמָּדִי</w:t>
+      </w:r>
+      <w:r>
+        <w:rPr>
+          <w:rFonts w:ascii="David" w:cs="David" w:eastAsia="David" w:hAnsi="David"/>
+          <w:sz w:val="24"/>
+          <w:szCs w:val="24"/>
+          <w:rtl/>
+        </w:rPr>
+        <w:t xml:space="preserve"> (פס׳ ח, בסוף פסוק) — צורת לוואי/הפסק של „עמי”. </w:t>
+      </w:r>
+      <w:r>
+        <w:rPr>
+          <w:rFonts w:ascii="David" w:cs="David" w:eastAsia="David" w:hAnsi="David"/>
+          <w:b/>
+          <w:bCs/>
+          <w:sz w:val="24"/>
+          <w:szCs w:val="24"/>
+          <w:rtl/>
+        </w:rPr>
+        <w:t xml:space="preserve">מְאֹד</w:t>
+      </w:r>
+      <w:r>
+        <w:rPr>
+          <w:rFonts w:ascii="David" w:cs="David" w:eastAsia="David" w:hAnsi="David"/>
+          <w:sz w:val="24"/>
+          <w:szCs w:val="24"/>
+          <w:rtl/>
+        </w:rPr>
+        <w:t xml:space="preserve"> (פס׳ יג, כ, בסוף פסוק) — צורת הפסק. כן צורות סוף-פסוק כגון </w:t>
+      </w:r>
+      <w:r>
+        <w:rPr>
+          <w:rFonts w:ascii="David" w:cs="David" w:eastAsia="David" w:hAnsi="David"/>
+          <w:b/>
+          <w:bCs/>
+          <w:sz w:val="24"/>
+          <w:szCs w:val="24"/>
+          <w:rtl/>
+        </w:rPr>
+        <w:t xml:space="preserve">בָנָיו, יְלָדֶיהָ, אֱלֹהָי, וּבֵינֵךְ</w:t>
+      </w:r>
+      <w:r>
+        <w:rPr>
+          <w:rFonts w:ascii="David" w:cs="David" w:eastAsia="David" w:hAnsi="David"/>
+          <w:sz w:val="24"/>
+          <w:szCs w:val="24"/>
+          <w:rtl/>
+        </w:rPr>
+        <w:t xml:space="preserve"> נהגות בהארכה/נסיגת טעם. </w:t>
+      </w:r>
+    </w:p>
+    <w:p>
+      <w:pPr>
+        <w:pStyle w:val="ListParagraph"/>
+        <w:numPr>
+          <w:ilvl w:val="0"/>
+          <w:numId w:val="2"/>
+        </w:numPr>
+        <w:bidi/>
+        <w:spacing w:after="80" w:line="300"/>
+        <w:jc w:val="both"/>
+      </w:pPr>
+      <w:r>
+        <w:rPr>
+          <w:rFonts w:ascii="David" w:cs="David" w:eastAsia="David" w:hAnsi="David"/>
+          <w:b/>
+          <w:bCs/>
+          <w:sz w:val="24"/>
+          <w:szCs w:val="24"/>
+          <w:rtl/>
+        </w:rPr>
+        <w:t xml:space="preserve">בעברית בת-ימינו: </w:t>
+      </w:r>
+      <w:r>
+        <w:rPr>
+          <w:rFonts w:ascii="David" w:cs="David" w:eastAsia="David" w:hAnsi="David"/>
+          <w:sz w:val="24"/>
+          <w:szCs w:val="24"/>
+          <w:rtl/>
+        </w:rPr>
+        <w:t xml:space="preserve">„לחם” נהגית תמיד באותו אופן; אין הבחנה בין הקשר להפסק.</w:t>
+      </w:r>
+    </w:p>
+    <w:p>
+      <w:pPr>
+        <w:bidi/>
+        <w:spacing w:after="100" w:before="160"/>
+        <w:jc w:val="right"/>
+      </w:pPr>
+      <w:r>
+        <w:rPr>
+          <w:rFonts w:ascii="David" w:cs="David" w:eastAsia="David" w:hAnsi="David"/>
+          <w:b/>
+          <w:bCs/>
+          <w:sz w:val="25"/>
+          <w:szCs w:val="25"/>
+          <w:rtl/>
+        </w:rPr>
+        <w:t xml:space="preserve">ב. הכינויים החבורים</w:t>
+      </w:r>
+    </w:p>
+    <w:p>
+      <w:pPr>
+        <w:bidi/>
+        <w:spacing w:after="120" w:line="320"/>
+        <w:jc w:val="both"/>
+      </w:pPr>
+      <w:r>
+        <w:rPr>
+          <w:rFonts w:ascii="David" w:cs="David" w:eastAsia="David" w:hAnsi="David"/>
+          <w:sz w:val="24"/>
+          <w:szCs w:val="24"/>
+          <w:rtl/>
+        </w:rPr>
+        <w:t xml:space="preserve">העברית הקלאסית נוהגת </w:t>
+      </w:r>
+      <w:r>
+        <w:rPr>
+          <w:rFonts w:ascii="David" w:cs="David" w:eastAsia="David" w:hAnsi="David"/>
+          <w:b/>
+          <w:bCs/>
+          <w:sz w:val="24"/>
+          <w:szCs w:val="24"/>
+          <w:rtl/>
+        </w:rPr>
+        <w:t xml:space="preserve">לחבר את הכינויים כסופיות</w:t>
+      </w:r>
+      <w:r>
+        <w:rPr>
+          <w:rFonts w:ascii="David" w:cs="David" w:eastAsia="David" w:hAnsi="David"/>
+          <w:sz w:val="24"/>
+          <w:szCs w:val="24"/>
+          <w:rtl/>
+        </w:rPr>
+        <w:t xml:space="preserve"> למילים אחרות (כינויי קניין ומושא), במקום המבנה ה</w:t>
+      </w:r>
+      <w:r>
+        <w:rPr>
+          <w:rFonts w:ascii="David" w:cs="David" w:eastAsia="David" w:hAnsi="David"/>
+          <w:b/>
+          <w:bCs/>
+          <w:sz w:val="24"/>
+          <w:szCs w:val="24"/>
+          <w:rtl/>
+        </w:rPr>
+        <w:t xml:space="preserve">אנליטי</w:t>
+      </w:r>
+      <w:r>
+        <w:rPr>
+          <w:rFonts w:ascii="David" w:cs="David" w:eastAsia="David" w:hAnsi="David"/>
+          <w:sz w:val="24"/>
+          <w:szCs w:val="24"/>
+          <w:rtl/>
+        </w:rPr>
+        <w:t xml:space="preserve"> (של, את) הרווח היום בעיקר בדיבור. הפרק עשיר בכך.</w:t>
+      </w:r>
+      <w:r>
+        <w:rPr>
+          <w:rStyle w:val="FootnoteReference"/>
+        </w:rPr>
+        <w:footnoteReference w:id="9"/>
+      </w:r>
+    </w:p>
+    <w:p>
+      <w:pPr>
+        <w:pStyle w:val="ListParagraph"/>
+        <w:numPr>
+          <w:ilvl w:val="0"/>
+          <w:numId w:val="2"/>
+        </w:numPr>
+        <w:bidi/>
+        <w:spacing w:after="80" w:line="300"/>
+        <w:jc w:val="both"/>
+      </w:pPr>
+      <w:r>
+        <w:rPr>
+          <w:rFonts w:ascii="David" w:cs="David" w:eastAsia="David" w:hAnsi="David"/>
+          <w:b/>
+          <w:bCs/>
+          <w:sz w:val="24"/>
+          <w:szCs w:val="24"/>
+          <w:rtl/>
+        </w:rPr>
+        <w:t xml:space="preserve">כינויי קניין (שם + סופית): </w:t>
+      </w:r>
+      <w:r>
+        <w:rPr>
+          <w:rFonts w:ascii="David" w:cs="David" w:eastAsia="David" w:hAnsi="David"/>
+          <w:sz w:val="24"/>
+          <w:szCs w:val="24"/>
+          <w:rtl/>
+        </w:rPr>
+        <w:t xml:space="preserve">אִשְׁתּוֹ, שְׁנֵי בָנָיו (א), בָנֶיהָ (ג), כַלֹּתֶיהָ (ו), יְלָדֶיהָ, אִישָׁהּ (ה), עַמּוֹ (ו), אִמָּהּ (ח), קוֹלָן (ט), חֲמוֹתָהּ (יד), יְבִמְתֵּךְ (טו), עַמֵּךְ, אֱלֹהַיִךְ (טז). </w:t>
+      </w:r>
+      <w:r>
+        <w:rPr>
+          <w:rFonts w:ascii="David" w:cs="David" w:eastAsia="David" w:hAnsi="David"/>
+          <w:b/>
+          <w:bCs/>
+          <w:sz w:val="24"/>
+          <w:szCs w:val="24"/>
+          <w:rtl/>
+        </w:rPr>
+        <w:t xml:space="preserve">בימינו (בדיבור): </w:t>
+      </w:r>
+      <w:r>
+        <w:rPr>
+          <w:rFonts w:ascii="David" w:cs="David" w:eastAsia="David" w:hAnsi="David"/>
+          <w:sz w:val="24"/>
+          <w:szCs w:val="24"/>
+          <w:rtl/>
+        </w:rPr>
+        <w:t xml:space="preserve">„אשתו”←„האישה שלו”, „בניה”←„הבנים שלה” — מבנה עם „של”; הסופיות שרדו בעיקר בלשון גבוהה ובצירופים קפואים.</w:t>
+      </w:r>
+    </w:p>
+    <w:p>
+      <w:pPr>
+        <w:pStyle w:val="ListParagraph"/>
+        <w:numPr>
+          <w:ilvl w:val="0"/>
+          <w:numId w:val="2"/>
+        </w:numPr>
+        <w:bidi/>
+        <w:spacing w:after="80" w:line="300"/>
+        <w:jc w:val="both"/>
+      </w:pPr>
+      <w:r>
+        <w:rPr>
+          <w:rFonts w:ascii="David" w:cs="David" w:eastAsia="David" w:hAnsi="David"/>
+          <w:b/>
+          <w:bCs/>
+          <w:sz w:val="24"/>
+          <w:szCs w:val="24"/>
+          <w:rtl/>
+        </w:rPr>
+        <w:t xml:space="preserve">כינויי מושא חבורים (פועל/מקור + סופית): </w:t>
+      </w:r>
+      <w:r>
+        <w:rPr>
+          <w:rFonts w:ascii="David" w:cs="David" w:eastAsia="David" w:hAnsi="David"/>
+          <w:sz w:val="24"/>
+          <w:szCs w:val="24"/>
+          <w:rtl/>
+        </w:rPr>
+        <w:t xml:space="preserve">לְעָזְבֵךְ (טז) = „לעזוב אותך”. </w:t>
+      </w:r>
+      <w:r>
+        <w:rPr>
+          <w:rFonts w:ascii="David" w:cs="David" w:eastAsia="David" w:hAnsi="David"/>
+          <w:b/>
+          <w:bCs/>
+          <w:sz w:val="24"/>
+          <w:szCs w:val="24"/>
+          <w:rtl/>
+        </w:rPr>
+        <w:t xml:space="preserve">בימינו: </w:t>
+      </w:r>
+      <w:r>
+        <w:rPr>
+          <w:rFonts w:ascii="David" w:cs="David" w:eastAsia="David" w:hAnsi="David"/>
+          <w:sz w:val="24"/>
+          <w:szCs w:val="24"/>
+          <w:rtl/>
+        </w:rPr>
+        <w:t xml:space="preserve">„את” + כינוי („אותך”); הכינוי החבור למושא כמעט אינו פרודוקטיבי.</w:t>
+      </w:r>
+    </w:p>
+    <w:p>
+      <w:pPr>
+        <w:pStyle w:val="ListParagraph"/>
+        <w:numPr>
+          <w:ilvl w:val="0"/>
+          <w:numId w:val="2"/>
+        </w:numPr>
+        <w:bidi/>
+        <w:spacing w:after="80" w:line="300"/>
+        <w:jc w:val="both"/>
+      </w:pPr>
+      <w:r>
+        <w:rPr>
+          <w:rFonts w:ascii="David" w:cs="David" w:eastAsia="David" w:hAnsi="David"/>
+          <w:b/>
+          <w:bCs/>
+          <w:sz w:val="24"/>
+          <w:szCs w:val="24"/>
+          <w:rtl/>
+        </w:rPr>
+        <w:t xml:space="preserve">כינויי יחס חבורים: </w:t>
+      </w:r>
+      <w:r>
+        <w:rPr>
+          <w:rFonts w:ascii="David" w:cs="David" w:eastAsia="David" w:hAnsi="David"/>
+          <w:sz w:val="24"/>
+          <w:szCs w:val="24"/>
+          <w:rtl/>
+        </w:rPr>
+        <w:t xml:space="preserve">לָהֶם, עִמָּהּ, בָּהּ, אֵלֶיהָ, עֲלֵיהֶן, בֵּינִי וּבֵינֵךְ (טז–יז). </w:t>
+      </w:r>
+      <w:r>
+        <w:rPr>
+          <w:rFonts w:ascii="David" w:cs="David" w:eastAsia="David" w:hAnsi="David"/>
+          <w:b/>
+          <w:bCs/>
+          <w:sz w:val="24"/>
+          <w:szCs w:val="24"/>
+          <w:rtl/>
+        </w:rPr>
+        <w:t xml:space="preserve">אלו דווקא נשתמרו כפרודוקטיביים גם בימינו</w:t>
+      </w:r>
+      <w:r>
+        <w:rPr>
+          <w:rFonts w:ascii="David" w:cs="David" w:eastAsia="David" w:hAnsi="David"/>
+          <w:sz w:val="24"/>
+          <w:szCs w:val="24"/>
+          <w:rtl/>
+        </w:rPr>
+        <w:t xml:space="preserve"> (איתה, עליהן, ביני ובינך).</w:t>
+      </w:r>
+    </w:p>
+    <w:p>
       <w:r>
         <w:br w:type="page"/>
       </w:r>
@@ -5706,7 +6353,7 @@
         <w:rPr>
           <w:rStyle w:val="FootnoteReference"/>
         </w:rPr>
-        <w:footnoteReference w:id="8"/>
+        <w:footnoteReference w:id="10"/>
       </w:r>
     </w:p>
     <w:p>
@@ -6430,7 +7077,47 @@
           <w:szCs w:val="24"/>
           <w:rtl/>
         </w:rPr>
-        <w:t xml:space="preserve"> נמצאו מילים רבות ששינו משמעות (פָּקַד, פָּגַע, גּוּר, יֶלֶד, מְנוּחָה) או שנדחקו מפני מילים אחרות (נשא אישה ← התחתן; איש ← בעל). מכלול זה ממחיש את המרחק — הצורני, התחבירי והסמנטי — בין לשון המקרא לעברית בת-ימינו.</w:t>
+        <w:t xml:space="preserve"> נמצאו מילים רבות ששינו משמעות (פָּקַד, פָּגַע, גּוּר, יֶלֶד, מְנוּחָה) או שנדחקו מפני מילים אחרות (נשא אישה ← התחתן; איש ← בעל). נוסף על אלה בולטים בפרק שני מאפיינים שנלמדו בקורס ושאין להם מקבילה במתכונתם המקראית בעברית המדוברת בת-ימינו: </w:t>
+      </w:r>
+      <w:r>
+        <w:rPr>
+          <w:rFonts w:ascii="David" w:cs="David" w:eastAsia="David" w:hAnsi="David"/>
+          <w:b/>
+          <w:bCs/>
+          <w:sz w:val="24"/>
+          <w:szCs w:val="24"/>
+          <w:rtl/>
+        </w:rPr>
+        <w:t xml:space="preserve">צורות ההפסק</w:t>
+      </w:r>
+      <w:r>
+        <w:rPr>
+          <w:rFonts w:ascii="David" w:cs="David" w:eastAsia="David" w:hAnsi="David"/>
+          <w:sz w:val="24"/>
+          <w:szCs w:val="24"/>
+          <w:rtl/>
+        </w:rPr>
+        <w:t xml:space="preserve"> (לֶחֶם מול לָחֶם, אף באותו פסוק) וה</w:t>
+      </w:r>
+      <w:r>
+        <w:rPr>
+          <w:rFonts w:ascii="David" w:cs="David" w:eastAsia="David" w:hAnsi="David"/>
+          <w:b/>
+          <w:bCs/>
+          <w:sz w:val="24"/>
+          <w:szCs w:val="24"/>
+          <w:rtl/>
+        </w:rPr>
+        <w:t xml:space="preserve">כינויים החבורים</w:t>
+      </w:r>
+      <w:r>
+        <w:rPr>
+          <w:rFonts w:ascii="David" w:cs="David" w:eastAsia="David" w:hAnsi="David"/>
+          <w:sz w:val="24"/>
+          <w:szCs w:val="24"/>
+          <w:rtl/>
+        </w:rPr>
+        <w:t xml:space="preserve"> (אִשְׁתּוֹ, כַלֹּתֶיהָ, לְעָזְבֵךְ), שנדחקו היום מפני המבנה האנליטי („של”, „את”). מכלול זה ממחיש את המרחק — הצורני, התחבירי והסמנטי — בין לשון המקרא לעברית בת-ימינו.</w:t>
       </w:r>
     </w:p>
     <w:p>
@@ -6817,7 +7504,7 @@
           <w:szCs w:val="18"/>
           <w:rtl/>
         </w:rPr>
-        <w:t xml:space="preserve">למונחים ולניתוח מערכת הפועל ראו: P. Joüon &amp; T. Muraoka, A Grammar of Biblical Hebrew, 2nd ed., Pontificio Istituto Biblico, Roma 2006, §§111–124; B. K. Waltke &amp; M. O’Connor, An Introduction to Biblical Hebrew Syntax, Eisenbrauns, Winona Lake 1990, chs. 32–36; י״ בלאו, תורת ההגה והצורות של לשון המקרא, מאגנס, ירושלים 2010.</w:t>
+        <w:t xml:space="preserve">למונחים ולניתוח מערכת הפועל ראו: P. Joüon &amp; T. Muraoka, A Grammar of Biblical Hebrew, 2nd ed., Pontificio Istituto Biblico, Roma 2006, §§111–124; B. K. Waltke &amp; M. O’Connor, An Introduction to Biblical Hebrew Syntax, Eisenbrauns, Winona Lake 1990, chs. 32–36; י״ בלאו, תורת ההגה והצורות של לשון המקרא, מאגנס, ירושלים 2010. על מורכבותה היתרה של מערכת הפועל המקראי ראו י״ קוטשר, תולדות הלשון העברית, מאגנס, ירושלים 1985, בפרק על לשון המקרא.</w:t>
       </w:r>
     </w:p>
   </w:footnote>
@@ -6891,6 +7578,52 @@
     </w:p>
   </w:footnote>
   <w:footnote w:id="8">
+    <w:p>
+      <w:pPr>
+        <w:bidi/>
+        <w:jc w:val="right"/>
+      </w:pPr>
+      <w:r>
+        <w:rPr>
+          <w:rStyle w:val="FootnoteReference"/>
+        </w:rPr>
+        <w:footnoteRef/>
+      </w:r>
+      <w:r>
+        <w:rPr>
+          <w:rFonts w:ascii="David" w:cs="David" w:eastAsia="David" w:hAnsi="David"/>
+          <w:sz w:val="18"/>
+          <w:szCs w:val="18"/>
+          <w:rtl/>
+        </w:rPr>
+        <w:t xml:space="preserve">על צורות ההפסק ראו GKC §29i ו-§68 ואילך; Joüon–Muraoka §32; ובאופן כללי י״ קוטשר, תולדות הלשון העברית, בפרק המסורה והניקוד.</w:t>
+      </w:r>
+    </w:p>
+  </w:footnote>
+  <w:footnote w:id="9">
+    <w:p>
+      <w:pPr>
+        <w:bidi/>
+        <w:jc w:val="right"/>
+      </w:pPr>
+      <w:r>
+        <w:rPr>
+          <w:rStyle w:val="FootnoteReference"/>
+        </w:rPr>
+        <w:footnoteRef/>
+      </w:r>
+      <w:r>
+        <w:rPr>
+          <w:rFonts w:ascii="David" w:cs="David" w:eastAsia="David" w:hAnsi="David"/>
+          <w:sz w:val="18"/>
+          <w:szCs w:val="18"/>
+          <w:rtl/>
+        </w:rPr>
+        <w:t xml:space="preserve">על הכינויים החבורים ראו GKC §58, §91, §103; Joüon–Muraoka §61–65, §94, §103. על הנטייה למבנה אנליטי בעברית בת-ימינו ראו קוטשר, תולדות הלשון העברית, בפרק העברית החדשה.</w:t>
+      </w:r>
+    </w:p>
+  </w:footnote>
+  <w:footnote w:id="10">
     <w:p>
       <w:pPr>
         <w:bidi/>

</xml_diff>